<commit_message>
docs(tfg): finalizar migración a LaTeX y cerrar documentación del proyecto
- Completa la migración de la memoria y anexos a la plantilla oficial LaTeX
- Reestructura y revisa el manual de usuario con capturas actualizadas
- Migra los casos de uso al nuevo formato tabular
- Actualiza la planificación temporal incorporando la iteración final
- Revisa el estudio de viabilidad económica y el anexo de sostenibilización
- Unifica referencias bibliográficas y citas en formato LaTeX
- Revisa la maquetación general de la documentación
- Mantiene los vídeos como material de apoyo para la defensa, optando por demostración en directo

Closes #46
Closes #47
Closes #48
</commit_message>
<xml_diff>
--- a/DocumentosTFG/Ficheros en Formato Anterior/Anexos TFG.docx
+++ b/DocumentosTFG/Ficheros en Formato Anterior/Anexos TFG.docx
@@ -14,7 +14,7 @@
           <w:shd w:val="clear" w:color="auto" w:fill="FFFFFF"/>
         </w:rPr>
         <w:drawing>
-          <wp:inline distT="0" distB="0" distL="0" distR="0" wp14:anchorId="6CBCFA8F" wp14:editId="52A4B79C">
+          <wp:inline distT="0" distB="0" distL="0" distR="0" wp14:anchorId="6CBCFA8F" wp14:editId="666DA879">
             <wp:extent cx="5400040" cy="1184275"/>
             <wp:effectExtent l="0" t="0" r="0" b="0"/>
             <wp:docPr id="1764844086" name="Imagen 1" descr="Interfaz de usuario gráfica, Texto&#10;&#10;Descripción generada automáticamente con confianza media"/>
@@ -797,7 +797,21 @@
                 <w:rStyle w:val="Hipervnculo"/>
                 <w:noProof/>
               </w:rPr>
-              <w:t>A.2. Planificación temporal</w:t>
+              <w:t>A.2. Planifi</w:t>
+            </w:r>
+            <w:r>
+              <w:rPr>
+                <w:rStyle w:val="Hipervnculo"/>
+                <w:noProof/>
+              </w:rPr>
+              <w:t>c</w:t>
+            </w:r>
+            <w:r>
+              <w:rPr>
+                <w:rStyle w:val="Hipervnculo"/>
+                <w:noProof/>
+              </w:rPr>
+              <w:t>ación temporal</w:t>
             </w:r>
             <w:r>
               <w:rPr>
@@ -31023,7 +31037,7 @@
     </w:p>
     <w:p>
       <w:r>
-        <w:t>Y haber configurado su certificado también en el apartado correspondiente. Puede configurarse uno propio de la aplicación o se puede leer del que disponga de una entidad CA.</w:t>
+        <w:t>Y haber configurado su certificado también en el apartado correspondiente. Puede configurarse uno propio de la aplicación.</w:t>
       </w:r>
     </w:p>
     <w:p>
@@ -31094,18 +31108,18 @@
     </w:p>
     <w:p>
       <w:r>
+        <w:t>Una vez el elector se ha asegurado de que esta en el censo adecuado y dispone de su certificado comprobado, puede proceder a la votación en la siguiente pantalla, siempre y cuando se encuentre en el o los días apropiados del calendario electoral.</w:t>
+      </w:r>
+    </w:p>
+    <w:p>
+      <w:pPr>
+        <w:keepNext/>
+      </w:pPr>
+      <w:r>
+        <w:rPr>
+          <w:noProof/>
+        </w:rPr>
         <w:lastRenderedPageBreak/>
-        <w:t>Una vez el elector se ha asegurado de que esta en el censo adecuado y dispone de su certificado comprobado, puede proceder a la votación en la siguiente pantalla, siempre y cuando se encuentre en el o los días apropiados del calendario electoral.</w:t>
-      </w:r>
-    </w:p>
-    <w:p>
-      <w:pPr>
-        <w:keepNext/>
-      </w:pPr>
-      <w:r>
-        <w:rPr>
-          <w:noProof/>
-        </w:rPr>
         <w:drawing>
           <wp:inline distT="0" distB="0" distL="0" distR="0" wp14:anchorId="3D005BBC" wp14:editId="39A3E04D">
             <wp:extent cx="5400040" cy="3613785"/>
@@ -31243,15 +31257,12 @@
         <w:t xml:space="preserve">Una vez aquí el elector seleccionaría a la candidatura que quiera votar, y asegurándose de que es la correcta se procede a la firma automática del voto, quedando este ya registrado en el sistema. Mientras este activa la votación se mantendrá la asociación entre </w:t>
       </w:r>
       <w:r>
-        <w:t xml:space="preserve">usuario y </w:t>
-      </w:r>
+        <w:t>usuario y voto a fin de que el usuario sepa que su voto está registrado y para que el sistema pueda controlar que el mismo usuario no vote en más de una ocasión. El sistema informará una vez se hay emitido el voto confirmando que este se emitió correctamente.</w:t>
+      </w:r>
+    </w:p>
+    <w:p>
       <w:r>
         <w:lastRenderedPageBreak/>
-        <w:t>voto a fin de que el usuario sepa que su voto está registrado y para que el sistema pueda controlar que el mismo usuario no vote en más de una ocasión. El sistema informará una vez se hay emitido el voto confirmando que este se emitió correctamente.</w:t>
-      </w:r>
-    </w:p>
-    <w:p>
-      <w:r>
         <w:t>Adicionalmente en la anterior ventana en la que se puede entrar a la votación disponemos de los botones para poner incidencias y para consultar las estadísticas. Las estadísticas se mostrarán en la siguiente fase. Las incidencias tendrán esta pinta:</w:t>
       </w:r>
     </w:p>
@@ -31343,7 +31354,6 @@
         <w:rPr>
           <w:noProof/>
         </w:rPr>
-        <w:lastRenderedPageBreak/>
         <w:drawing>
           <wp:inline distT="0" distB="0" distL="0" distR="0" wp14:anchorId="4FA32B09" wp14:editId="41B6DC99">
             <wp:extent cx="4514850" cy="2319010"/>
@@ -31404,6 +31414,7 @@
     </w:p>
     <w:p>
       <w:r>
+        <w:lastRenderedPageBreak/>
         <w:t xml:space="preserve">Una vez realizadas estas operaciones se podrá proceder a la siguiente fase. Al finalizar esta fase garantizamos que se ha procedido a la emisión de los votos, estos se almacenan de forma segura y anónima una vez acabe la fase y se podrá autorizar a la mesa a proceder con el recuento </w:t>
       </w:r>
       <w:r>
@@ -31460,7 +31471,6 @@
         <w:rPr>
           <w:noProof/>
         </w:rPr>
-        <w:lastRenderedPageBreak/>
         <w:drawing>
           <wp:inline distT="0" distB="0" distL="0" distR="0" wp14:anchorId="168C7B53" wp14:editId="07EC122E">
             <wp:extent cx="5400040" cy="3560445"/>
@@ -31533,6 +31543,7 @@
     <w:p/>
     <w:p>
       <w:r>
+        <w:lastRenderedPageBreak/>
         <w:t xml:space="preserve">Una vez verificado el recuento, la Mesa Electoral procede a la publicación de resultados. Esto hace que los resultados pasen a ser visibles para el resto de los usuarios, el proceso electoral se considera cerrado y no es posible realizar nuevas acciones sobre la votación. </w:t>
       </w:r>
     </w:p>
@@ -31582,7 +31593,6 @@
     </w:p>
     <w:p>
       <w:r>
-        <w:lastRenderedPageBreak/>
         <w:t xml:space="preserve">Los que podrán ver directamente estas estadísticas son los electores, el resto de </w:t>
       </w:r>
       <w:r>

</xml_diff>